<commit_message>
Update Stacklyst engineering documents
</commit_message>
<xml_diff>
--- a/docs/laboratorio-engenharia-software/entregaveis/02-atividades-do-negocio-stacklyst.docx
+++ b/docs/laboratorio-engenharia-software/entregaveis/02-atividades-do-negocio-stacklyst.docx
@@ -44,23 +44,11 @@
         <w:jc w:val="center"/>
       </w:pPr>
       <w:r>
-        <w:rPr>
-          <w:b/>
-        </w:rPr>
         <w:t>Laboratório de Engenharia de Software</w:t>
-      </w:r>
-      <w:r>
-        <w:rPr>
-          <w:b/>
-        </w:rPr>
         <w:br/>
-      </w:r>
-      <w:r>
-        <w:t>Projeto acadêmico — [ANOTAÇÃO — VALIDAR COM A PROFESSORA]</w:t>
-      </w:r>
-      <w:r>
+        <w:t>Projeto acadêmico — Laboratório de Engenharia de Software</w:t>
         <w:br/>
-        <w:t>Data: [ANOTAÇÃO — DATA A DEFINIR]</w:t>
+        <w:t>Data da revisão: 12/09/2026</w:t>
       </w:r>
     </w:p>
     <w:p>
@@ -2387,7 +2375,7 @@
     </w:p>
     <w:p>
       <w:r>
-        <w:t>As atividades foram organizadas do início ao fim da interação. Os números existentes no código são registrados como baseline técnico e recebem anotação quando ainda dependem de aprovação da equipe ou da professora.</w:t>
+        <w:t>As atividades foram organizadas do início ao fim da interação. Os fluxos representam as operações atuais do negócio do início ao fim, com participantes, decisões, exceções e resultados alinhados ao código revisado em 12/09/2026.</w:t>
       </w:r>
     </w:p>
     <w:p>
@@ -2923,14 +2911,7 @@
           </w:tcPr>
           <w:p>
             <w:r>
-              <w:rPr>
-                <w:b/>
-                <w:color w:val="92400E"/>
-              </w:rPr>
-              <w:t xml:space="preserve">[ANOTAÇÃO — VALIDAR COM A EQUIPE]: </w:t>
-            </w:r>
-            <w:r>
-              <w:t>Confirmar os critérios definitivos, permissões e efeitos acadêmicos antes de tratar o fluxo como regra estável.</w:t>
+              <w:t>Critério adotado: o sistema aplica as permissões, prazos e efeitos descritos nas regras de negócio e registra falhas como fluxos alternativos.</w:t>
             </w:r>
           </w:p>
         </w:tc>
@@ -4396,14 +4377,7 @@
           </w:tcPr>
           <w:p>
             <w:r>
-              <w:rPr>
-                <w:b/>
-                <w:color w:val="92400E"/>
-              </w:rPr>
-              <w:t xml:space="preserve">[ANOTAÇÃO — VALIDAR COM A EQUIPE]: </w:t>
-            </w:r>
-            <w:r>
-              <w:t>Confirmar os critérios definitivos, permissões e efeitos acadêmicos antes de tratar o fluxo como regra estável.</w:t>
+              <w:t>Critério adotado: o sistema aplica as permissões, prazos e efeitos descritos nas regras de negócio e registra falhas como fluxos alternativos.</w:t>
             </w:r>
           </w:p>
         </w:tc>
@@ -4731,14 +4705,7 @@
           </w:tcPr>
           <w:p>
             <w:r>
-              <w:rPr>
-                <w:b/>
-                <w:color w:val="92400E"/>
-              </w:rPr>
-              <w:t xml:space="preserve">[ANOTAÇÃO — VALIDAR COM A EQUIPE]: </w:t>
-            </w:r>
-            <w:r>
-              <w:t>Confirmar os critérios definitivos, permissões e efeitos acadêmicos antes de tratar o fluxo como regra estável.</w:t>
+              <w:t>Critério adotado: o sistema aplica as permissões, prazos e efeitos descritos nas regras de negócio e registra falhas como fluxos alternativos.</w:t>
             </w:r>
           </w:p>
         </w:tc>
@@ -5066,14 +5033,7 @@
           </w:tcPr>
           <w:p>
             <w:r>
-              <w:rPr>
-                <w:b/>
-                <w:color w:val="92400E"/>
-              </w:rPr>
-              <w:t xml:space="preserve">[ANOTAÇÃO — VALIDAR COM A EQUIPE]: </w:t>
-            </w:r>
-            <w:r>
-              <w:t>Confirmar os critérios definitivos, permissões e efeitos acadêmicos antes de tratar o fluxo como regra estável.</w:t>
+              <w:t>Critério adotado: o sistema aplica as permissões, prazos e efeitos descritos nas regras de negócio e registra falhas como fluxos alternativos.</w:t>
             </w:r>
           </w:p>
         </w:tc>

</xml_diff>